<commit_message>
Admin guide: new image names (qbtstagingcontainergrip / qbtcontainergrip :latest) and pull policy
Co-Authored-By: Claude Sonnet 5.5 <noreply@anthropic.com>
Claude-Session: https://claude.ai/code/session_01P3CrRqPN2pSfxacToKGYP9
</commit_message>
<xml_diff>
--- a/Query-Builder-v6-Kubernetes-Admin-Guide.docx
+++ b/Query-Builder-v6-Kubernetes-Admin-Guide.docx
@@ -81,7 +81,7 @@
           <w:sz w:val="22"/>
           <w:szCs w:val="22"/>
         </w:rPr>
-        <w:t xml:space="preserve">Three settings must all be right. If any one is missing, downloads silently land in the wrong place, even with an older image:</w:t>
+        <w:t xml:space="preserve">Three settings must all be right. If any one is missing, downloads and uploads silently go to the wrong place:</w:t>
       </w:r>
     </w:p>
     <w:p>
@@ -508,84 +508,18 @@
       <w:r>
         <w:rPr>
           <w:rFonts w:ascii="Calibri" w:cs="Calibri" w:eastAsia="Calibri" w:hAnsi="Calibri"/>
-          <w:b/>
-          <w:bCs/>
-          <w:sz w:val="22"/>
-          <w:szCs w:val="22"/>
-        </w:rPr>
-        <w:t xml:space="preserve">Give every build a unique tag</w:t>
-      </w:r>
-      <w:r>
-        <w:rPr>
-          <w:rFonts w:ascii="Calibri" w:cs="Calibri" w:eastAsia="Calibri" w:hAnsi="Calibri"/>
-          <w:sz w:val="22"/>
-          <w:szCs w:val="22"/>
-        </w:rPr>
-        <w:t xml:space="preserve"> (for example </w:t>
-      </w:r>
-      <w:r>
-        <w:rPr>
-          <w:rFonts w:ascii="Consolas" w:cs="Consolas" w:eastAsia="Consolas" w:hAnsi="Consolas"/>
-          <w:sz w:val="20"/>
-          <w:szCs w:val="20"/>
-        </w:rPr>
-        <w:t xml:space="preserve">:grip-v6-20261016</w:t>
-      </w:r>
-      <w:r>
-        <w:rPr>
-          <w:rFonts w:ascii="Calibri" w:cs="Calibri" w:eastAsia="Calibri" w:hAnsi="Calibri"/>
-          <w:sz w:val="22"/>
-          <w:szCs w:val="22"/>
-        </w:rPr>
-        <w:t xml:space="preserve">), or deploy by digest. Re-using </w:t>
-      </w:r>
-      <w:r>
-        <w:rPr>
-          <w:rFonts w:ascii="Consolas" w:cs="Consolas" w:eastAsia="Consolas" w:hAnsi="Consolas"/>
-          <w:sz w:val="20"/>
-          <w:szCs w:val="20"/>
-        </w:rPr>
-        <w:t xml:space="preserve">:grip</w:t>
-      </w:r>
-      <w:r>
-        <w:rPr>
-          <w:rFonts w:ascii="Calibri" w:cs="Calibri" w:eastAsia="Calibri" w:hAnsi="Calibri"/>
-          <w:sz w:val="22"/>
-          <w:szCs w:val="22"/>
-        </w:rPr>
-        <w:t xml:space="preserve"> lets a node keep serving a cached old image when </w:t>
-      </w:r>
-      <w:r>
-        <w:rPr>
-          <w:rFonts w:ascii="Consolas" w:cs="Consolas" w:eastAsia="Consolas" w:hAnsi="Consolas"/>
-          <w:sz w:val="20"/>
-          <w:szCs w:val="20"/>
-        </w:rPr>
-        <w:t xml:space="preserve">imagePullPolicy: IfNotPresent</w:t>
-      </w:r>
-      <w:r>
-        <w:rPr>
-          <w:rFonts w:ascii="Calibri" w:cs="Calibri" w:eastAsia="Calibri" w:hAnsi="Calibri"/>
-          <w:sz w:val="22"/>
-          <w:szCs w:val="22"/>
-        </w:rPr>
-        <w:t xml:space="preserve">. If you must re-use a tag, set </w:t>
-      </w:r>
-      <w:r>
-        <w:rPr>
-          <w:rFonts w:ascii="Consolas" w:cs="Consolas" w:eastAsia="Consolas" w:hAnsi="Consolas"/>
-          <w:sz w:val="20"/>
-          <w:szCs w:val="20"/>
-        </w:rPr>
-        <w:t xml:space="preserve">imagePullPolicy: Always</w:t>
-      </w:r>
-      <w:r>
-        <w:rPr>
-          <w:rFonts w:ascii="Calibri" w:cs="Calibri" w:eastAsia="Calibri" w:hAnsi="Calibri"/>
-          <w:sz w:val="22"/>
-          <w:szCs w:val="22"/>
-        </w:rPr>
-        <w:t xml:space="preserve">.</w:t>
+          <w:sz w:val="22"/>
+          <w:szCs w:val="22"/>
+        </w:rPr>
+        <w:t xml:space="preserve">Staging image: </w:t>
+      </w:r>
+      <w:r>
+        <w:rPr>
+          <w:rFonts w:ascii="Consolas" w:cs="Consolas" w:eastAsia="Consolas" w:hAnsi="Consolas"/>
+          <w:sz w:val="20"/>
+          <w:szCs w:val="20"/>
+        </w:rPr>
+        <w:t xml:space="preserve">qbtcontainers.azurecr.io/qbtstagingcontainergrip:latest</w:t>
       </w:r>
     </w:p>
     <w:p>
@@ -603,77 +537,15 @@
           <w:sz w:val="22"/>
           <w:szCs w:val="22"/>
         </w:rPr>
-        <w:t xml:space="preserve">Air-gapped clusters: </w:t>
-      </w:r>
-      <w:r>
-        <w:rPr>
-          <w:rFonts w:ascii="Consolas" w:cs="Consolas" w:eastAsia="Consolas" w:hAnsi="Consolas"/>
-          <w:sz w:val="20"/>
-          <w:szCs w:val="20"/>
-        </w:rPr>
-        <w:t xml:space="preserve">docker load</w:t>
-      </w:r>
-      <w:r>
-        <w:rPr>
-          <w:rFonts w:ascii="Calibri" w:cs="Calibri" w:eastAsia="Calibri" w:hAnsi="Calibri"/>
-          <w:sz w:val="22"/>
-          <w:szCs w:val="22"/>
-        </w:rPr>
-        <w:t xml:space="preserve"> the tar, retag, and push it to the internal registry. The Deployment must reference that internal tag.</w:t>
-      </w:r>
-    </w:p>
-    <w:p>
-      <w:pPr>
-        <w:pStyle w:val="Heading1"/>
-        <w:spacing w:after="120" w:before="300"/>
-      </w:pPr>
-      <w:r>
-        <w:rPr>
-          <w:rFonts w:ascii="Calibri" w:cs="Calibri" w:eastAsia="Calibri" w:hAnsi="Calibri"/>
-          <w:b/>
-          <w:bCs/>
-          <w:color w:val="1F3864"/>
-          <w:sz w:val="30"/>
-          <w:szCs w:val="30"/>
-        </w:rPr>
-        <w:t xml:space="preserve">2. Set QB_DOWNLOAD_DIR and mount the share at the same path</w:t>
-      </w:r>
-    </w:p>
-    <w:p>
-      <w:pPr>
-        <w:spacing w:after="120"/>
-      </w:pPr>
-      <w:r>
-        <w:rPr>
-          <w:rFonts w:ascii="Consolas" w:cs="Consolas" w:eastAsia="Consolas" w:hAnsi="Consolas"/>
-          <w:sz w:val="20"/>
-          <w:szCs w:val="20"/>
-        </w:rPr>
-        <w:t xml:space="preserve">QB_DOWNLOAD_DIR</w:t>
-      </w:r>
-      <w:r>
-        <w:rPr>
-          <w:rFonts w:ascii="Calibri" w:cs="Calibri" w:eastAsia="Calibri" w:hAnsi="Calibri"/>
-          <w:sz w:val="22"/>
-          <w:szCs w:val="22"/>
-        </w:rPr>
-        <w:t xml:space="preserve"> (default </w:t>
-      </w:r>
-      <w:r>
-        <w:rPr>
-          <w:rFonts w:ascii="Consolas" w:cs="Consolas" w:eastAsia="Consolas" w:hAnsi="Consolas"/>
-          <w:sz w:val="20"/>
-          <w:szCs w:val="20"/>
-        </w:rPr>
-        <w:t xml:space="preserve">/downloads</w:t>
-      </w:r>
-      <w:r>
-        <w:rPr>
-          <w:rFonts w:ascii="Calibri" w:cs="Calibri" w:eastAsia="Calibri" w:hAnsi="Calibri"/>
-          <w:sz w:val="22"/>
-          <w:szCs w:val="22"/>
-        </w:rPr>
-        <w:t xml:space="preserve">) is the one variable that drives Chromium's download policy, the save dialog's "Downloads" shortcut, the folders the save and upload dialogs open at, and the permission-fix service.</w:t>
+        <w:t xml:space="preserve">Production image: </w:t>
+      </w:r>
+      <w:r>
+        <w:rPr>
+          <w:rFonts w:ascii="Consolas" w:cs="Consolas" w:eastAsia="Consolas" w:hAnsi="Consolas"/>
+          <w:sz w:val="20"/>
+          <w:szCs w:val="20"/>
+        </w:rPr>
+        <w:t xml:space="preserve">qbtcontainers.azurecr.io/qbtcontainergrip:latest</w:t>
       </w:r>
     </w:p>
     <w:p>
@@ -691,91 +563,103 @@
           <w:sz w:val="22"/>
           <w:szCs w:val="22"/>
         </w:rPr>
-        <w:t xml:space="preserve">The mount path and </w:t>
-      </w:r>
-      <w:r>
-        <w:rPr>
-          <w:rFonts w:ascii="Consolas" w:cs="Consolas" w:eastAsia="Consolas" w:hAnsi="Consolas"/>
-          <w:sz w:val="20"/>
-          <w:szCs w:val="20"/>
-        </w:rPr>
-        <w:t xml:space="preserve">QB_DOWNLOAD_DIR</w:t>
-      </w:r>
-      <w:r>
-        <w:rPr>
-          <w:rFonts w:ascii="Calibri" w:cs="Calibri" w:eastAsia="Calibri" w:hAnsi="Calibri"/>
-          <w:sz w:val="22"/>
-          <w:szCs w:val="22"/>
-        </w:rPr>
-        <w:t xml:space="preserve"> </w:t>
-      </w:r>
-      <w:r>
-        <w:rPr>
-          <w:rFonts w:ascii="Calibri" w:cs="Calibri" w:eastAsia="Calibri" w:hAnsi="Calibri"/>
-          <w:b/>
-          <w:bCs/>
-          <w:sz w:val="22"/>
-          <w:szCs w:val="22"/>
-        </w:rPr>
-        <w:t xml:space="preserve">must be identical</w:t>
-      </w:r>
-      <w:r>
-        <w:rPr>
-          <w:rFonts w:ascii="Calibri" w:cs="Calibri" w:eastAsia="Calibri" w:hAnsi="Calibri"/>
-          <w:sz w:val="22"/>
-          <w:szCs w:val="22"/>
-        </w:rPr>
-        <w:t xml:space="preserve"> and are </w:t>
-      </w:r>
-      <w:r>
-        <w:rPr>
-          <w:rFonts w:ascii="Calibri" w:cs="Calibri" w:eastAsia="Calibri" w:hAnsi="Calibri"/>
-          <w:b/>
-          <w:bCs/>
-          <w:sz w:val="22"/>
-          <w:szCs w:val="22"/>
-        </w:rPr>
-        <w:t xml:space="preserve">case-sensitive</w:t>
-      </w:r>
-      <w:r>
-        <w:rPr>
-          <w:rFonts w:ascii="Calibri" w:cs="Calibri" w:eastAsia="Calibri" w:hAnsi="Calibri"/>
-          <w:sz w:val="22"/>
-          <w:szCs w:val="22"/>
-        </w:rPr>
-        <w:t xml:space="preserve"> (</w:t>
-      </w:r>
-      <w:r>
-        <w:rPr>
-          <w:rFonts w:ascii="Consolas" w:cs="Consolas" w:eastAsia="Consolas" w:hAnsi="Consolas"/>
-          <w:sz w:val="20"/>
-          <w:szCs w:val="20"/>
-        </w:rPr>
-        <w:t xml:space="preserve">/config/Downloads</w:t>
-      </w:r>
-      <w:r>
-        <w:rPr>
-          <w:rFonts w:ascii="Calibri" w:cs="Calibri" w:eastAsia="Calibri" w:hAnsi="Calibri"/>
-          <w:sz w:val="22"/>
-          <w:szCs w:val="22"/>
-        </w:rPr>
-        <w:t xml:space="preserve"> is not </w:t>
-      </w:r>
-      <w:r>
-        <w:rPr>
-          <w:rFonts w:ascii="Consolas" w:cs="Consolas" w:eastAsia="Consolas" w:hAnsi="Consolas"/>
-          <w:sz w:val="20"/>
-          <w:szCs w:val="20"/>
-        </w:rPr>
-        <w:t xml:space="preserve">/config/downloads</w:t>
-      </w:r>
-      <w:r>
-        <w:rPr>
-          <w:rFonts w:ascii="Calibri" w:cs="Calibri" w:eastAsia="Calibri" w:hAnsi="Calibri"/>
-          <w:sz w:val="22"/>
-          <w:szCs w:val="22"/>
-        </w:rPr>
-        <w:t xml:space="preserve">).</w:t>
+        <w:t xml:space="preserve">The images are tagged </w:t>
+      </w:r>
+      <w:r>
+        <w:rPr>
+          <w:rFonts w:ascii="Consolas" w:cs="Consolas" w:eastAsia="Consolas" w:hAnsi="Consolas"/>
+          <w:sz w:val="20"/>
+          <w:szCs w:val="20"/>
+        </w:rPr>
+        <w:t xml:space="preserve">:latest</w:t>
+      </w:r>
+      <w:r>
+        <w:rPr>
+          <w:rFonts w:ascii="Calibri" w:cs="Calibri" w:eastAsia="Calibri" w:hAnsi="Calibri"/>
+          <w:sz w:val="22"/>
+          <w:szCs w:val="22"/>
+        </w:rPr>
+        <w:t xml:space="preserve">, so set </w:t>
+      </w:r>
+      <w:r>
+        <w:rPr>
+          <w:rFonts w:ascii="Consolas" w:cs="Consolas" w:eastAsia="Consolas" w:hAnsi="Consolas"/>
+          <w:sz w:val="20"/>
+          <w:szCs w:val="20"/>
+        </w:rPr>
+        <w:t xml:space="preserve">imagePullPolicy: Always</w:t>
+      </w:r>
+      <w:r>
+        <w:rPr>
+          <w:rFonts w:ascii="Calibri" w:cs="Calibri" w:eastAsia="Calibri" w:hAnsi="Calibri"/>
+          <w:sz w:val="22"/>
+          <w:szCs w:val="22"/>
+        </w:rPr>
+        <w:t xml:space="preserve"> (or leave it unset: Kubernetes then defaults to </w:t>
+      </w:r>
+      <w:r>
+        <w:rPr>
+          <w:rFonts w:ascii="Consolas" w:cs="Consolas" w:eastAsia="Consolas" w:hAnsi="Consolas"/>
+          <w:sz w:val="20"/>
+          <w:szCs w:val="20"/>
+        </w:rPr>
+        <w:t xml:space="preserve">Always</w:t>
+      </w:r>
+      <w:r>
+        <w:rPr>
+          <w:rFonts w:ascii="Calibri" w:cs="Calibri" w:eastAsia="Calibri" w:hAnsi="Calibri"/>
+          <w:sz w:val="22"/>
+          <w:szCs w:val="22"/>
+        </w:rPr>
+        <w:t xml:space="preserve"> for </w:t>
+      </w:r>
+      <w:r>
+        <w:rPr>
+          <w:rFonts w:ascii="Consolas" w:cs="Consolas" w:eastAsia="Consolas" w:hAnsi="Consolas"/>
+          <w:sz w:val="20"/>
+          <w:szCs w:val="20"/>
+        </w:rPr>
+        <w:t xml:space="preserve">:latest</w:t>
+      </w:r>
+      <w:r>
+        <w:rPr>
+          <w:rFonts w:ascii="Calibri" w:cs="Calibri" w:eastAsia="Calibri" w:hAnsi="Calibri"/>
+          <w:sz w:val="22"/>
+          <w:szCs w:val="22"/>
+        </w:rPr>
+        <w:t xml:space="preserve">). With </w:t>
+      </w:r>
+      <w:r>
+        <w:rPr>
+          <w:rFonts w:ascii="Consolas" w:cs="Consolas" w:eastAsia="Consolas" w:hAnsi="Consolas"/>
+          <w:sz w:val="20"/>
+          <w:szCs w:val="20"/>
+        </w:rPr>
+        <w:t xml:space="preserve">IfNotPresent</w:t>
+      </w:r>
+      <w:r>
+        <w:rPr>
+          <w:rFonts w:ascii="Calibri" w:cs="Calibri" w:eastAsia="Calibri" w:hAnsi="Calibri"/>
+          <w:sz w:val="22"/>
+          <w:szCs w:val="22"/>
+        </w:rPr>
+        <w:t xml:space="preserve">, a node keeps serving a cached old image after a new push. After a new push, run </w:t>
+      </w:r>
+      <w:r>
+        <w:rPr>
+          <w:rFonts w:ascii="Consolas" w:cs="Consolas" w:eastAsia="Consolas" w:hAnsi="Consolas"/>
+          <w:sz w:val="20"/>
+          <w:szCs w:val="20"/>
+        </w:rPr>
+        <w:t xml:space="preserve">kubectl rollout restart deployment/qb</w:t>
+      </w:r>
+      <w:r>
+        <w:rPr>
+          <w:rFonts w:ascii="Calibri" w:cs="Calibri" w:eastAsia="Calibri" w:hAnsi="Calibri"/>
+          <w:sz w:val="22"/>
+          <w:szCs w:val="22"/>
+        </w:rPr>
+        <w:t xml:space="preserve"> so the pods pull it, or deploy by digest to pin an exact build.</w:t>
       </w:r>
     </w:p>
     <w:p>
@@ -793,41 +677,61 @@
           <w:sz w:val="22"/>
           <w:szCs w:val="22"/>
         </w:rPr>
-        <w:t xml:space="preserve">Recommended on Kubernetes: mount the share </w:t>
-      </w:r>
+        <w:t xml:space="preserve">Air-gapped clusters: </w:t>
+      </w:r>
+      <w:r>
+        <w:rPr>
+          <w:rFonts w:ascii="Consolas" w:cs="Consolas" w:eastAsia="Consolas" w:hAnsi="Consolas"/>
+          <w:sz w:val="20"/>
+          <w:szCs w:val="20"/>
+        </w:rPr>
+        <w:t xml:space="preserve">docker load</w:t>
+      </w:r>
+      <w:r>
+        <w:rPr>
+          <w:rFonts w:ascii="Calibri" w:cs="Calibri" w:eastAsia="Calibri" w:hAnsi="Calibri"/>
+          <w:sz w:val="22"/>
+          <w:szCs w:val="22"/>
+        </w:rPr>
+        <w:t xml:space="preserve"> the tar, retag, and push it to the internal registry. The Deployment must reference that internal tag.</w:t>
+      </w:r>
+    </w:p>
+    <w:p>
+      <w:pPr>
+        <w:pStyle w:val="Heading1"/>
+        <w:spacing w:after="120" w:before="300"/>
+      </w:pPr>
       <w:r>
         <w:rPr>
           <w:rFonts w:ascii="Calibri" w:cs="Calibri" w:eastAsia="Calibri" w:hAnsi="Calibri"/>
           <w:b/>
           <w:bCs/>
-          <w:sz w:val="22"/>
-          <w:szCs w:val="22"/>
-        </w:rPr>
-        <w:t xml:space="preserve">outside</w:t>
-      </w:r>
-      <w:r>
-        <w:rPr>
-          <w:rFonts w:ascii="Calibri" w:cs="Calibri" w:eastAsia="Calibri" w:hAnsi="Calibri"/>
-          <w:sz w:val="22"/>
-          <w:szCs w:val="22"/>
-        </w:rPr>
-        <w:t xml:space="preserve"> </w:t>
-      </w:r>
-      <w:r>
-        <w:rPr>
-          <w:rFonts w:ascii="Consolas" w:cs="Consolas" w:eastAsia="Consolas" w:hAnsi="Consolas"/>
-          <w:sz w:val="20"/>
-          <w:szCs w:val="20"/>
-        </w:rPr>
-        <w:t xml:space="preserve">/config</w:t>
-      </w:r>
-      <w:r>
-        <w:rPr>
-          <w:rFonts w:ascii="Calibri" w:cs="Calibri" w:eastAsia="Calibri" w:hAnsi="Calibri"/>
-          <w:sz w:val="22"/>
-          <w:szCs w:val="22"/>
-        </w:rPr>
-        <w:t xml:space="preserve"> (</w:t>
+          <w:color w:val="1F3864"/>
+          <w:sz w:val="30"/>
+          <w:szCs w:val="30"/>
+        </w:rPr>
+        <w:t xml:space="preserve">2. Set QB_DOWNLOAD_DIR and mount the share at the same path</w:t>
+      </w:r>
+    </w:p>
+    <w:p>
+      <w:pPr>
+        <w:spacing w:after="120"/>
+      </w:pPr>
+      <w:r>
+        <w:rPr>
+          <w:rFonts w:ascii="Consolas" w:cs="Consolas" w:eastAsia="Consolas" w:hAnsi="Consolas"/>
+          <w:sz w:val="20"/>
+          <w:szCs w:val="20"/>
+        </w:rPr>
+        <w:t xml:space="preserve">QB_DOWNLOAD_DIR</w:t>
+      </w:r>
+      <w:r>
+        <w:rPr>
+          <w:rFonts w:ascii="Calibri" w:cs="Calibri" w:eastAsia="Calibri" w:hAnsi="Calibri"/>
+          <w:sz w:val="22"/>
+          <w:szCs w:val="22"/>
+        </w:rPr>
+        <w:t xml:space="preserve"> (default </w:t>
       </w:r>
       <w:r>
         <w:rPr>
@@ -843,23 +747,7 @@
           <w:sz w:val="22"/>
           <w:szCs w:val="22"/>
         </w:rPr>
-        <w:t xml:space="preserve">). The base image recursively changes ownership of all of </w:t>
-      </w:r>
-      <w:r>
-        <w:rPr>
-          <w:rFonts w:ascii="Consolas" w:cs="Consolas" w:eastAsia="Consolas" w:hAnsi="Consolas"/>
-          <w:sz w:val="20"/>
-          <w:szCs w:val="20"/>
-        </w:rPr>
-        <w:t xml:space="preserve">/config</w:t>
-      </w:r>
-      <w:r>
-        <w:rPr>
-          <w:rFonts w:ascii="Calibri" w:cs="Calibri" w:eastAsia="Calibri" w:hAnsi="Calibri"/>
-          <w:sz w:val="22"/>
-          <w:szCs w:val="22"/>
-        </w:rPr>
-        <w:t xml:space="preserve"> on every start, which is very slow on a network share (Azure Files/CIFS).</w:t>
+        <w:t xml:space="preserve">) is the one variable that drives Chromium's download policy, the save dialog's "Downloads" shortcut, the folders the save and upload dialogs open at, and the permission-fix service.</w:t>
       </w:r>
     </w:p>
     <w:p>
@@ -877,6 +765,192 @@
           <w:sz w:val="22"/>
           <w:szCs w:val="22"/>
         </w:rPr>
+        <w:t xml:space="preserve">The mount path and </w:t>
+      </w:r>
+      <w:r>
+        <w:rPr>
+          <w:rFonts w:ascii="Consolas" w:cs="Consolas" w:eastAsia="Consolas" w:hAnsi="Consolas"/>
+          <w:sz w:val="20"/>
+          <w:szCs w:val="20"/>
+        </w:rPr>
+        <w:t xml:space="preserve">QB_DOWNLOAD_DIR</w:t>
+      </w:r>
+      <w:r>
+        <w:rPr>
+          <w:rFonts w:ascii="Calibri" w:cs="Calibri" w:eastAsia="Calibri" w:hAnsi="Calibri"/>
+          <w:sz w:val="22"/>
+          <w:szCs w:val="22"/>
+        </w:rPr>
+        <w:t xml:space="preserve"> </w:t>
+      </w:r>
+      <w:r>
+        <w:rPr>
+          <w:rFonts w:ascii="Calibri" w:cs="Calibri" w:eastAsia="Calibri" w:hAnsi="Calibri"/>
+          <w:b/>
+          <w:bCs/>
+          <w:sz w:val="22"/>
+          <w:szCs w:val="22"/>
+        </w:rPr>
+        <w:t xml:space="preserve">must be identical</w:t>
+      </w:r>
+      <w:r>
+        <w:rPr>
+          <w:rFonts w:ascii="Calibri" w:cs="Calibri" w:eastAsia="Calibri" w:hAnsi="Calibri"/>
+          <w:sz w:val="22"/>
+          <w:szCs w:val="22"/>
+        </w:rPr>
+        <w:t xml:space="preserve"> and are </w:t>
+      </w:r>
+      <w:r>
+        <w:rPr>
+          <w:rFonts w:ascii="Calibri" w:cs="Calibri" w:eastAsia="Calibri" w:hAnsi="Calibri"/>
+          <w:b/>
+          <w:bCs/>
+          <w:sz w:val="22"/>
+          <w:szCs w:val="22"/>
+        </w:rPr>
+        <w:t xml:space="preserve">case-sensitive</w:t>
+      </w:r>
+      <w:r>
+        <w:rPr>
+          <w:rFonts w:ascii="Calibri" w:cs="Calibri" w:eastAsia="Calibri" w:hAnsi="Calibri"/>
+          <w:sz w:val="22"/>
+          <w:szCs w:val="22"/>
+        </w:rPr>
+        <w:t xml:space="preserve"> (</w:t>
+      </w:r>
+      <w:r>
+        <w:rPr>
+          <w:rFonts w:ascii="Consolas" w:cs="Consolas" w:eastAsia="Consolas" w:hAnsi="Consolas"/>
+          <w:sz w:val="20"/>
+          <w:szCs w:val="20"/>
+        </w:rPr>
+        <w:t xml:space="preserve">/config/Downloads</w:t>
+      </w:r>
+      <w:r>
+        <w:rPr>
+          <w:rFonts w:ascii="Calibri" w:cs="Calibri" w:eastAsia="Calibri" w:hAnsi="Calibri"/>
+          <w:sz w:val="22"/>
+          <w:szCs w:val="22"/>
+        </w:rPr>
+        <w:t xml:space="preserve"> is not </w:t>
+      </w:r>
+      <w:r>
+        <w:rPr>
+          <w:rFonts w:ascii="Consolas" w:cs="Consolas" w:eastAsia="Consolas" w:hAnsi="Consolas"/>
+          <w:sz w:val="20"/>
+          <w:szCs w:val="20"/>
+        </w:rPr>
+        <w:t xml:space="preserve">/config/downloads</w:t>
+      </w:r>
+      <w:r>
+        <w:rPr>
+          <w:rFonts w:ascii="Calibri" w:cs="Calibri" w:eastAsia="Calibri" w:hAnsi="Calibri"/>
+          <w:sz w:val="22"/>
+          <w:szCs w:val="22"/>
+        </w:rPr>
+        <w:t xml:space="preserve">).</w:t>
+      </w:r>
+    </w:p>
+    <w:p>
+      <w:pPr>
+        <w:pStyle w:val="ListParagraph"/>
+        <w:numPr>
+          <w:ilvl w:val="0"/>
+          <w:numId w:val="3"/>
+        </w:numPr>
+        <w:spacing w:after="80"/>
+      </w:pPr>
+      <w:r>
+        <w:rPr>
+          <w:rFonts w:ascii="Calibri" w:cs="Calibri" w:eastAsia="Calibri" w:hAnsi="Calibri"/>
+          <w:sz w:val="22"/>
+          <w:szCs w:val="22"/>
+        </w:rPr>
+        <w:t xml:space="preserve">Recommended on Kubernetes: mount the share </w:t>
+      </w:r>
+      <w:r>
+        <w:rPr>
+          <w:rFonts w:ascii="Calibri" w:cs="Calibri" w:eastAsia="Calibri" w:hAnsi="Calibri"/>
+          <w:b/>
+          <w:bCs/>
+          <w:sz w:val="22"/>
+          <w:szCs w:val="22"/>
+        </w:rPr>
+        <w:t xml:space="preserve">outside</w:t>
+      </w:r>
+      <w:r>
+        <w:rPr>
+          <w:rFonts w:ascii="Calibri" w:cs="Calibri" w:eastAsia="Calibri" w:hAnsi="Calibri"/>
+          <w:sz w:val="22"/>
+          <w:szCs w:val="22"/>
+        </w:rPr>
+        <w:t xml:space="preserve"> </w:t>
+      </w:r>
+      <w:r>
+        <w:rPr>
+          <w:rFonts w:ascii="Consolas" w:cs="Consolas" w:eastAsia="Consolas" w:hAnsi="Consolas"/>
+          <w:sz w:val="20"/>
+          <w:szCs w:val="20"/>
+        </w:rPr>
+        <w:t xml:space="preserve">/config</w:t>
+      </w:r>
+      <w:r>
+        <w:rPr>
+          <w:rFonts w:ascii="Calibri" w:cs="Calibri" w:eastAsia="Calibri" w:hAnsi="Calibri"/>
+          <w:sz w:val="22"/>
+          <w:szCs w:val="22"/>
+        </w:rPr>
+        <w:t xml:space="preserve"> (</w:t>
+      </w:r>
+      <w:r>
+        <w:rPr>
+          <w:rFonts w:ascii="Consolas" w:cs="Consolas" w:eastAsia="Consolas" w:hAnsi="Consolas"/>
+          <w:sz w:val="20"/>
+          <w:szCs w:val="20"/>
+        </w:rPr>
+        <w:t xml:space="preserve">/downloads</w:t>
+      </w:r>
+      <w:r>
+        <w:rPr>
+          <w:rFonts w:ascii="Calibri" w:cs="Calibri" w:eastAsia="Calibri" w:hAnsi="Calibri"/>
+          <w:sz w:val="22"/>
+          <w:szCs w:val="22"/>
+        </w:rPr>
+        <w:t xml:space="preserve">). The base image recursively changes ownership of all of </w:t>
+      </w:r>
+      <w:r>
+        <w:rPr>
+          <w:rFonts w:ascii="Consolas" w:cs="Consolas" w:eastAsia="Consolas" w:hAnsi="Consolas"/>
+          <w:sz w:val="20"/>
+          <w:szCs w:val="20"/>
+        </w:rPr>
+        <w:t xml:space="preserve">/config</w:t>
+      </w:r>
+      <w:r>
+        <w:rPr>
+          <w:rFonts w:ascii="Calibri" w:cs="Calibri" w:eastAsia="Calibri" w:hAnsi="Calibri"/>
+          <w:sz w:val="22"/>
+          <w:szCs w:val="22"/>
+        </w:rPr>
+        <w:t xml:space="preserve"> on every start, which is very slow on a network share (Azure Files/CIFS).</w:t>
+      </w:r>
+    </w:p>
+    <w:p>
+      <w:pPr>
+        <w:pStyle w:val="ListParagraph"/>
+        <w:numPr>
+          <w:ilvl w:val="0"/>
+          <w:numId w:val="3"/>
+        </w:numPr>
+        <w:spacing w:after="80"/>
+      </w:pPr>
+      <w:r>
+        <w:rPr>
+          <w:rFonts w:ascii="Calibri" w:cs="Calibri" w:eastAsia="Calibri" w:hAnsi="Calibri"/>
+          <w:sz w:val="22"/>
+          <w:szCs w:val="22"/>
+        </w:rPr>
         <w:t xml:space="preserve">If the share must sit inside </w:t>
       </w:r>
       <w:r>
@@ -1058,38 +1132,6 @@
           <w:sz w:val="20"/>
           <w:szCs w:val="20"/>
         </w:rPr>
-        <w:t xml:space="preserve">&lt;REGISTRY&gt;</w:t>
-      </w:r>
-      <w:r>
-        <w:rPr>
-          <w:rFonts w:ascii="Calibri" w:cs="Calibri" w:eastAsia="Calibri" w:hAnsi="Calibri"/>
-          <w:sz w:val="22"/>
-          <w:szCs w:val="22"/>
-        </w:rPr>
-        <w:t xml:space="preserve">, </w:t>
-      </w:r>
-      <w:r>
-        <w:rPr>
-          <w:rFonts w:ascii="Consolas" w:cs="Consolas" w:eastAsia="Consolas" w:hAnsi="Consolas"/>
-          <w:sz w:val="20"/>
-          <w:szCs w:val="20"/>
-        </w:rPr>
-        <w:t xml:space="preserve">&lt;TAG&gt;</w:t>
-      </w:r>
-      <w:r>
-        <w:rPr>
-          <w:rFonts w:ascii="Calibri" w:cs="Calibri" w:eastAsia="Calibri" w:hAnsi="Calibri"/>
-          <w:sz w:val="22"/>
-          <w:szCs w:val="22"/>
-        </w:rPr>
-        <w:t xml:space="preserve">, </w:t>
-      </w:r>
-      <w:r>
-        <w:rPr>
-          <w:rFonts w:ascii="Consolas" w:cs="Consolas" w:eastAsia="Consolas" w:hAnsi="Consolas"/>
-          <w:sz w:val="20"/>
-          <w:szCs w:val="20"/>
-        </w:rPr>
         <w:t xml:space="preserve">&lt;PVC_OR_SHARE&gt;</w:t>
       </w:r>
       <w:r>
@@ -1098,7 +1140,7 @@
           <w:sz w:val="22"/>
           <w:szCs w:val="22"/>
         </w:rPr>
-        <w:t xml:space="preserve">, and the IDs (they should match the owner of the share).</w:t>
+        <w:t xml:space="preserve"> and the IDs (they should match the owner of the share). The example uses the production image; use the staging image name on staging.</w:t>
       </w:r>
     </w:p>
     <w:p>
@@ -1368,25 +1410,43 @@
           <w:sz w:val="18"/>
           <w:szCs w:val="18"/>
         </w:rPr>
-        <w:t xml:space="preserve">          image: &lt;REGISTRY&gt;/qbtcontainer:&lt;TAG&gt;</w:t>
-      </w:r>
-    </w:p>
-    <w:p>
-      <w:pPr>
-        <w:pBdr>
-          <w:left w:val="single" w:color="1F3864" w:sz="12" w:space="6"/>
-        </w:pBdr>
-        <w:shd w:fill="F2F2F2" w:val="clear"/>
-        <w:spacing w:after="0"/>
-        <w:ind w:left="200"/>
-      </w:pPr>
-      <w:r>
-        <w:rPr>
-          <w:rFonts w:ascii="Consolas" w:cs="Consolas" w:eastAsia="Consolas" w:hAnsi="Consolas"/>
-          <w:sz w:val="18"/>
-          <w:szCs w:val="18"/>
-        </w:rPr>
-        <w:t xml:space="preserve">          imagePullPolicy: IfNotPresent   # Always if the tag is re-used</w:t>
+        <w:t xml:space="preserve">          # production image; on staging use qbtstagingcontainergrip</w:t>
+      </w:r>
+    </w:p>
+    <w:p>
+      <w:pPr>
+        <w:pBdr>
+          <w:left w:val="single" w:color="1F3864" w:sz="12" w:space="6"/>
+        </w:pBdr>
+        <w:shd w:fill="F2F2F2" w:val="clear"/>
+        <w:spacing w:after="0"/>
+        <w:ind w:left="200"/>
+      </w:pPr>
+      <w:r>
+        <w:rPr>
+          <w:rFonts w:ascii="Consolas" w:cs="Consolas" w:eastAsia="Consolas" w:hAnsi="Consolas"/>
+          <w:sz w:val="18"/>
+          <w:szCs w:val="18"/>
+        </w:rPr>
+        <w:t xml:space="preserve">          image: qbtcontainers.azurecr.io/qbtcontainergrip:latest</w:t>
+      </w:r>
+    </w:p>
+    <w:p>
+      <w:pPr>
+        <w:pBdr>
+          <w:left w:val="single" w:color="1F3864" w:sz="12" w:space="6"/>
+        </w:pBdr>
+        <w:shd w:fill="F2F2F2" w:val="clear"/>
+        <w:spacing w:after="0"/>
+        <w:ind w:left="200"/>
+      </w:pPr>
+      <w:r>
+        <w:rPr>
+          <w:rFonts w:ascii="Consolas" w:cs="Consolas" w:eastAsia="Consolas" w:hAnsi="Consolas"/>
+          <w:sz w:val="18"/>
+          <w:szCs w:val="18"/>
+        </w:rPr>
+        <w:t xml:space="preserve">          imagePullPolicy: Always   # the tag is :latest</w:t>
       </w:r>
     </w:p>
     <w:p>

</xml_diff>